<commit_message>
Xat va ma'lumotnoma: XAT-BLANK-NAMUNA.docx shablonida qabul qiluvchi matni turga qarab
Xat blankida "{manzil}da istiqomat qiluvchi fuqaro {kimga}ga" matni qotirib yozilgan edi:
kompaniyaga yuborilgan xatda ham "fuqaro "ABC" MCHJga" chiqardi, manzilsiz xatda esa
tepada bo'sh "da istiqomat qiluvchi" qatori qolardi.

Shablon teglari 1-ogohlantirish bilan bir xil qilindi ({manzil}{manzil_son},
{kimga_old}{kimga}{kimga_son}); qiymatlar umumiy recipientTags() dan olinadi:
fuqaro -> "...da istiqomat qiluvchi fuqaro <ism>ga", kompaniya -> "...da joylashgan
<nom> direktori <F.I.Sh.>ga" (direktor bo'lmasa "<nom>ga"); manzil bo'lmasa, "da ..." qismi yozilmaydi.

Tekshirildi (haqiqiy Postgres, hosil bo'lgan docx matni): xat va ma'lumotnoma uchun
kompaniya/fuqaro, manzil bor/yo'q, direktor bor/yo'q; 1-ogohlantirish buzilmagan.

Co-Authored-By: Claude Sonnet 5.5 <noreply@anthropic.com>
Claude-Session: https://claude.ai/code/session_018Dq4bhCQ4myEvnW12Zfe1Z
</commit_message>
<xml_diff>
--- a/templates/XAT-BLANK-NAMUNA.docx
+++ b/templates/XAT-BLANK-NAMUNA.docx
@@ -165,7 +165,7 @@
                 <w:szCs w:val="25"/>
                 <w:lang w:val="en-US"/>
               </w:rPr>
-              <w:t xml:space="preserve">da istiqomat qiluvchi </w:t>
+              <w:t xml:space="preserve">{manzil_son}</w:t>
             </w:r>
           </w:p>
           <w:p>
@@ -187,7 +187,7 @@
                 <w:szCs w:val="25"/>
                 <w:lang w:val="en-US"/>
               </w:rPr>
-              <w:t xml:space="preserve">fuqaro </w:t>
+              <w:t xml:space="preserve">{kimga_old}</w:t>
             </w:r>
             <w:r>
               <w:rPr>
@@ -206,7 +206,7 @@
                 <w:szCs w:val="25"/>
                 <w:lang w:val="en-US"/>
               </w:rPr>
-              <w:t>ga</w:t>
+              <w:t xml:space="preserve">{kimga_son}</w:t>
             </w:r>
           </w:p>
           <w:p>

</xml_diff>

<commit_message>
Xat va ma'lumotnoma: XAT-BLANK-NAMUNA.docx shablonida qabul qiluvchi matni turga qarab (#22)
Xat blankida "{manzil}da istiqomat qiluvchi fuqaro {kimga}ga" matni qotirib yozilgan edi:
kompaniyaga yuborilgan xatda ham "fuqaro "ABC" MCHJga" chiqardi, manzilsiz xatda esa
tepada bo'sh "da istiqomat qiluvchi" qatori qolardi.

Shablon teglari 1-ogohlantirish bilan bir xil qilindi ({manzil}{manzil_son},
{kimga_old}{kimga}{kimga_son}); qiymatlar umumiy recipientTags() dan olinadi:
fuqaro -> "...da istiqomat qiluvchi fuqaro <ism>ga", kompaniya -> "...da joylashgan
<nom> direktori <F.I.Sh.>ga" (direktor bo'lmasa "<nom>ga"); manzil bo'lmasa, "da ..." qismi yozilmaydi.

Tekshirildi (haqiqiy Postgres, hosil bo'lgan docx matni): xat va ma'lumotnoma uchun
kompaniya/fuqaro, manzil bor/yo'q, direktor bor/yo'q; 1-ogohlantirish buzilmagan.


Claude-Session: https://claude.ai/code/session_018Dq4bhCQ4myEvnW12Zfe1Z

Co-authored-by: Claude <noreply@anthropic.com>
</commit_message>
<xml_diff>
--- a/templates/XAT-BLANK-NAMUNA.docx
+++ b/templates/XAT-BLANK-NAMUNA.docx
@@ -165,7 +165,7 @@
                 <w:szCs w:val="25"/>
                 <w:lang w:val="en-US"/>
               </w:rPr>
-              <w:t xml:space="preserve">da istiqomat qiluvchi </w:t>
+              <w:t xml:space="preserve">{manzil_son}</w:t>
             </w:r>
           </w:p>
           <w:p>
@@ -187,7 +187,7 @@
                 <w:szCs w:val="25"/>
                 <w:lang w:val="en-US"/>
               </w:rPr>
-              <w:t xml:space="preserve">fuqaro </w:t>
+              <w:t xml:space="preserve">{kimga_old}</w:t>
             </w:r>
             <w:r>
               <w:rPr>
@@ -206,7 +206,7 @@
                 <w:szCs w:val="25"/>
                 <w:lang w:val="en-US"/>
               </w:rPr>
-              <w:t>ga</w:t>
+              <w:t xml:space="preserve">{kimga_son}</w:t>
             </w:r>
           </w:p>
           <w:p>

</xml_diff>